<commit_message>
PR7: remove unused variant field from report
</commit_message>
<xml_diff>
--- a/docs/REPORT_PR7.docx
+++ b/docs/REPORT_PR7.docx
@@ -95,15 +95,6 @@
         <w:t>Преподаватель</w:t>
         <w:br/>
         <w:t>Ящун Татьяна Викторовна</w:t>
-      </w:r>
-    </w:p>
-    <w:p>
-      <w:pPr>
-        <w:ind w:firstLine="0"/>
-        <w:jc w:val="right"/>
-      </w:pPr>
-      <w:r>
-        <w:t>Вариант: __________</w:t>
       </w:r>
     </w:p>
     <w:p>

</xml_diff>